<commit_message>
Add buy-in feasibility analysis and Dec 2025 holdco merger to IPAR/ITP note
New section 9 covers structural and tax analysis of a potential minority
buy-in: PACTE 90% squeeze-out threshold, double voting rights (72.3%
capital / 83.2% votes), France-US treaty dividend withholding (5% vs 0%
at 80%), sticky retail register, and the Nov-Dec 2025 absorption of
Interparfums Holding SAS as revealed preference for keeping the listing.

Co-Authored-By: Claude Fable 5 <noreply@anthropic.com>
Claude-Session: https://claude.ai/code/session_01VbMigRPbvtSxymKRbEnfdx
</commit_message>
<xml_diff>
--- a/Interparfums_IPAR_vs_ITP_Premium.docx
+++ b/Interparfums_IPAR_vs_ITP_Premium.docx
@@ -657,7 +657,7 @@
                 <w:sz w:val="18"/>
                 <w:szCs w:val="18"/>
               </w:rPr>
-              <w:t xml:space="preserve">Founders Jean Madar (Chairman/CEO) &amp; Philippe Benacin, combined beneficial ownership ~mid-40s%</w:t>
+              <w:t xml:space="preserve">Founders Jean Madar (Chairman/CEO) &amp; Philippe Benacin, combined beneficial ownership ~mid-40s% (~22% each)</w:t>
             </w:r>
           </w:p>
         </w:tc>
@@ -684,7 +684,7 @@
                 <w:sz w:val="18"/>
                 <w:szCs w:val="18"/>
               </w:rPr>
-              <w:t xml:space="preserve">~72% owned by Interparfums Inc; Philippe Benacin is CEO of the SA</w:t>
+              <w:t xml:space="preserve">72.3% of capital / 83.2% of voting rights held by Interparfums Inc (directly since Dec 2025, previously via Interparfums Holding SAS); Philippe Benacin is CEO of the SA. Double voting rights accrue to registered shares held 3+ years (83.8m shares carry ~144.8m net votes)</w:t>
             </w:r>
           </w:p>
         </w:tc>
@@ -2092,7 +2092,7 @@
           <w:sz w:val="20"/>
           <w:szCs w:val="20"/>
         </w:rPr>
-        <w:t xml:space="preserve">Rochas (acquired 2015) — brand ownership rather than license.</w:t>
+        <w:t xml:space="preserve">Rochas (acquired 2015) and Goutal (acquired from Amorepacific, announced March 2025) — brand ownership rather than license.</w:t>
       </w:r>
     </w:p>
     <w:p>
@@ -3651,7 +3651,7 @@
                 <w:sz w:val="18"/>
                 <w:szCs w:val="18"/>
               </w:rPr>
-              <w:t xml:space="preserve">Jun 2026</w:t>
+              <w:t xml:space="preserve">Nov–Dec 2025</w:t>
             </w:r>
           </w:p>
         </w:tc>
@@ -3677,7 +3677,7 @@
                 <w:sz w:val="18"/>
                 <w:szCs w:val="18"/>
               </w:rPr>
-              <w:t xml:space="preserve">ITP completes its 27th consecutive annual free-share attribution (1 new share per 20 held; ~4.2m new shares) — a hallmark of its French retail-holder register.</w:t>
+              <w:t xml:space="preserve">Structure simplification: Interparfums SA absorbs Interparfums Holding SAS (the non-operating intermediate holdco whose sole asset was the 72.3% ITP stake), approved at the 17 Dec 2025 EGM, making Interparfums Inc the direct 72.3% shareholder. The AMF examined the operation (6 Nov 2025) and ruled under Article 236-6 that no public withdrawal offer (OPR) to minorities was required. Notably, management simplified the chain while leaving the minority listing untouched.</w:t>
             </w:r>
           </w:p>
         </w:tc>
@@ -3706,7 +3706,7 @@
                 <w:sz w:val="18"/>
                 <w:szCs w:val="18"/>
               </w:rPr>
-              <w:t xml:space="preserve">22–27 Jul 2026</w:t>
+              <w:t xml:space="preserve">Jun 2026</w:t>
             </w:r>
           </w:p>
         </w:tc>
@@ -3733,7 +3733,7 @@
                 <w:sz w:val="18"/>
                 <w:szCs w:val="18"/>
               </w:rPr>
-              <w:t xml:space="preserve">Q2/H1 sales. IPAR (USD): Q2 +2%, US segment +18%, Europe −4%. ITP (EUR): H1 sales €414m, −3.7% constant-FX / −7.3% reported; FY26 guided €850–870m; H1 operating margin guided 19–20% vs 23.2%. ITP drops ~9% to ~€23.8–24.3, near its 52-week low, then rebounds ~8% over the following weeks as brand detail (Jimmy Choo +23%) reassures.</w:t>
+              <w:t xml:space="preserve">ITP completes its 27th consecutive annual free-share attribution (1 new share per 20 held; ~4.2m new shares) — a hallmark of its French retail-holder register.</w:t>
             </w:r>
           </w:p>
         </w:tc>
@@ -3761,6 +3761,61 @@
                 <w:sz w:val="18"/>
                 <w:szCs w:val="18"/>
               </w:rPr>
+              <w:t xml:space="preserve">22–27 Jul 2026</w:t>
+            </w:r>
+          </w:p>
+        </w:tc>
+        <w:tc>
+          <w:tcPr>
+            <w:tcW w:type="dxa" w:w="7936"/>
+            <w:tcMar>
+              <w:top w:type="dxa" w:w="60"/>
+              <w:left w:type="dxa" w:w="100"/>
+              <w:bottom w:type="dxa" w:w="60"/>
+              <w:right w:type="dxa" w:w="100"/>
+            </w:tcMar>
+          </w:tcPr>
+          <w:p>
+            <w:pPr>
+              <w:jc w:val="left"/>
+            </w:pPr>
+            <w:r>
+              <w:rPr>
+                <w:b w:val="false"/>
+                <w:bCs w:val="false"/>
+                <w:color w:val="000000"/>
+                <w:sz w:val="18"/>
+                <w:szCs w:val="18"/>
+              </w:rPr>
+              <w:t xml:space="preserve">Q2/H1 sales. IPAR (USD): Q2 +2%, US segment +18%, Europe −4%. ITP (EUR): H1 sales €414m, −3.7% constant-FX / −7.3% reported; FY26 guided €850–870m; H1 operating margin guided 19–20% vs 23.2%. ITP drops ~9% to ~€23.8–24.3, near its 52-week low, then rebounds ~8% over the following weeks as brand detail (Jimmy Choo +23%) reassures.</w:t>
+            </w:r>
+          </w:p>
+        </w:tc>
+      </w:tr>
+      <w:tr>
+        <w:tc>
+          <w:tcPr>
+            <w:tcW w:type="dxa" w:w="1800"/>
+            <w:shd w:fill="F2F2F2" w:val="clear"/>
+            <w:tcMar>
+              <w:top w:type="dxa" w:w="60"/>
+              <w:left w:type="dxa" w:w="100"/>
+              <w:bottom w:type="dxa" w:w="60"/>
+              <w:right w:type="dxa" w:w="100"/>
+            </w:tcMar>
+          </w:tcPr>
+          <w:p>
+            <w:pPr>
+              <w:jc w:val="left"/>
+            </w:pPr>
+            <w:r>
+              <w:rPr>
+                <w:b w:val="false"/>
+                <w:bCs w:val="false"/>
+                <w:color w:val="000000"/>
+                <w:sz w:val="18"/>
+                <w:szCs w:val="18"/>
+              </w:rPr>
               <w:t xml:space="preserve">4 Aug 2026</w:t>
             </w:r>
           </w:p>
@@ -3768,6 +3823,7 @@
         <w:tc>
           <w:tcPr>
             <w:tcW w:type="dxa" w:w="7936"/>
+            <w:shd w:fill="F2F2F2" w:val="clear"/>
             <w:tcMar>
               <w:top w:type="dxa" w:w="60"/>
               <w:left w:type="dxa" w:w="100"/>
@@ -4092,7 +4148,7 @@
           <w:sz w:val="26"/>
           <w:szCs w:val="26"/>
         </w:rPr>
-        <w:t xml:space="preserve">9. Conclusion</w:t>
+        <w:t xml:space="preserve">9. Could IPAR Buy In the ITP Minorities? Structural &amp; Tax Analysis</w:t>
       </w:r>
     </w:p>
     <w:p>
@@ -4101,74 +4157,35 @@
       </w:pPr>
       <w:r>
         <w:rPr>
-          <w:sz w:val="20"/>
-          <w:szCs w:val="20"/>
-        </w:rPr>
-        <w:t xml:space="preserve">IPAR US's premium over ITP FP is the sum of three stacked effects: </w:t>
-      </w:r>
-      <w:r>
-        <w:rPr>
-          <w:b/>
-          <w:bCs/>
-          <w:sz w:val="20"/>
-          <w:szCs w:val="20"/>
-        </w:rPr>
-        <w:t xml:space="preserve">(i) a composition effect</w:t>
-      </w:r>
-      <w:r>
-        <w:rPr>
-          <w:sz w:val="20"/>
-          <w:szCs w:val="20"/>
-        </w:rPr>
-        <w:t xml:space="preserve"> — IPAR includes a wholly-owned US business currently growing 18% that ITP holders don't touch; </w:t>
-      </w:r>
-      <w:r>
-        <w:rPr>
-          <w:b/>
-          <w:bCs/>
-          <w:sz w:val="20"/>
-          <w:szCs w:val="20"/>
-        </w:rPr>
-        <w:t xml:space="preserve">(ii) a structural market-access effect</w:t>
-      </w:r>
-      <w:r>
-        <w:rPr>
-          <w:sz w:val="20"/>
-          <w:szCs w:val="20"/>
-        </w:rPr>
-        <w:t xml:space="preserve"> — liquidity, float, US indices, coverage and control all reside with the parent; and </w:t>
-      </w:r>
-      <w:r>
-        <w:rPr>
-          <w:b/>
-          <w:bCs/>
-          <w:sz w:val="20"/>
-          <w:szCs w:val="20"/>
-        </w:rPr>
-        <w:t xml:space="preserve">(iii) a 12-month news-flow effect</w:t>
-      </w:r>
-      <w:r>
-        <w:rPr>
-          <w:sz w:val="20"/>
-          <w:szCs w:val="20"/>
-        </w:rPr>
-        <w:t xml:space="preserve"> — FX translation and a run of SA-level disappointments (guidance fog, margin cut, Boucheron, Middle East, tariffs, Lacoste) de-rated the Paris line by ~25% while IPAR recovered fully from its own governance wobble. On look-through economics ITP is unambiguously the cheaper claim on the group's best assets and pays ~4%+ to wait; but with no buy-in catalyst, a 27% float and €1.5–2m daily liquidity, cheapness alone has never been sufficient here. For absolute-return investors the Paris line is a patient, income-carrying value position; for anyone benchmarked, liquidity-constrained or momentum-aware, the market's verdict — pay up for the parent — is likely to remain the path of least resistance into 2027.</w:t>
-      </w:r>
-    </w:p>
-    <w:p>
-      <w:pPr>
-        <w:pStyle w:val="Heading1"/>
-        <w:spacing w:after="120" w:before="280"/>
-      </w:pPr>
-      <w:r>
-        <w:rPr>
-          <w:b/>
-          <w:bCs/>
-          <w:color w:val="1F3864"/>
-          <w:sz w:val="26"/>
-          <w:szCs w:val="26"/>
-        </w:rPr>
-        <w:t xml:space="preserve">Appendix: Principal Sources</w:t>
+          <w:b/>
+          <w:bCs/>
+          <w:sz w:val="20"/>
+          <w:szCs w:val="20"/>
+        </w:rPr>
+        <w:t xml:space="preserve">Short answer: nothing prohibits it — the barriers are frictions and incentives, not law. </w:t>
+      </w:r>
+      <w:r>
+        <w:rPr>
+          <w:sz w:val="20"/>
+          <w:szCs w:val="20"/>
+        </w:rPr>
+        <w:t xml:space="preserve">A buy-in would be mechanically straightforward in form: as an existing majority holder, IPAR could file a simplified cash tender offer (offre publique d'achat simplifiée) with the AMF at any time, and since the 2019 PACTE law a squeeze-out (retrait obligatoire) is available at 90% of both capital and voting rights (lowered from 95%). On voting rights IPAR is nearly there already — 83.2% — because its long-held registered shares carry double votes. The binding constraint is capital: 72.3%, meaning IPAR would need roughly two-thirds of the 27.7% free float (~17.7% of capital, ~€470m at market before any premium) to tender.</w:t>
+      </w:r>
+    </w:p>
+    <w:p>
+      <w:pPr>
+        <w:pStyle w:val="Heading2"/>
+        <w:spacing w:after="80" w:before="200"/>
+      </w:pPr>
+      <w:r>
+        <w:rPr>
+          <w:b/>
+          <w:bCs/>
+          <w:color w:val="2E5597"/>
+          <w:sz w:val="22"/>
+          <w:szCs w:val="22"/>
+        </w:rPr>
+        <w:t xml:space="preserve">9.1 Why execution would be harder than it looks</w:t>
       </w:r>
     </w:p>
     <w:p>
@@ -4182,10 +4199,19 @@
       </w:pPr>
       <w:r>
         <w:rPr>
-          <w:sz w:val="20"/>
-          <w:szCs w:val="20"/>
-        </w:rPr>
-        <w:t xml:space="preserve">Interparfums Inc press releases: record FY2025 results (24 Feb 2026); Q1 2026 results (5 May 2026); Q2 2026 net sales (22 Jul 2026); Q2/H1 2026 results and reaffirmed guidance (4 Aug 2026) — GlobeNewswire/SEC filings.</w:t>
+          <w:b/>
+          <w:bCs/>
+          <w:sz w:val="20"/>
+          <w:szCs w:val="20"/>
+        </w:rPr>
+        <w:t xml:space="preserve">A sticky, tax-disincentivised retail register. </w:t>
+      </w:r>
+      <w:r>
+        <w:rPr>
+          <w:sz w:val="20"/>
+          <w:szCs w:val="20"/>
+        </w:rPr>
+        <w:t xml:space="preserve">Much of the float sits with long-term French retail holders accumulated through 27 consecutive years of bonus-share attributions, with a near-zero cost basis. Tendering crystallises French capital gains tax (30% flat tax / PFU), whereas holding earns a ~4%+ yield and — under French rules — a basis step-up at death. A rational fraction of the register simply never tenders; a failed offer that stalls below 90% of capital would leave IPAR with an even less liquid, still-listed rump.</w:t>
       </w:r>
     </w:p>
     <w:p>
@@ -4199,10 +4225,19 @@
       </w:pPr>
       <w:r>
         <w:rPr>
-          <w:sz w:val="20"/>
-          <w:szCs w:val="20"/>
-        </w:rPr>
-        <w:t xml:space="preserve">Interparfums SA (interparfums-finance.fr): H1 2026 sales release (€414.3m, −3.7% cc / −7.3% reported; FY26 guide €850–870m); FY2025 results (operating margin 19.5%, net margin 14.1%, dividend €1.05).</w:t>
+          <w:b/>
+          <w:bCs/>
+          <w:sz w:val="20"/>
+          <w:szCs w:val="20"/>
+        </w:rPr>
+        <w:t xml:space="preserve">AMF process and price scrutiny. </w:t>
+      </w:r>
+      <w:r>
+        <w:rPr>
+          <w:sz w:val="20"/>
+          <w:szCs w:val="20"/>
+        </w:rPr>
+        <w:t xml:space="preserve">A buy-in requires an independent expert's fairness opinion (attestation d'équité), and minority-shareholder associations routinely contest squeeze-out pricing. The optics are awkward: IPAR would be offering ~16x earnings (plus a control premium) for a business the market values inside IPAR's own shares at ~24x — an obvious line of attack for holdouts demanding a higher price, which erodes the arbitrage that motivates the deal.</w:t>
       </w:r>
     </w:p>
     <w:p>
@@ -4216,10 +4251,19 @@
       </w:pPr>
       <w:r>
         <w:rPr>
-          <w:sz w:val="20"/>
-          <w:szCs w:val="20"/>
-        </w:rPr>
-        <w:t xml:space="preserve">SEC filings: NT 10-K (Mar 2026); 8-K auditor change Forvis Mazars → Grant Thornton (May 2026) via StockTitan/Investing.com summaries.</w:t>
+          <w:b/>
+          <w:bCs/>
+          <w:sz w:val="20"/>
+          <w:szCs w:val="20"/>
+        </w:rPr>
+        <w:t xml:space="preserve">Financing and founder dilution. </w:t>
+      </w:r>
+      <w:r>
+        <w:rPr>
+          <w:sz w:val="20"/>
+          <w:szCs w:val="20"/>
+        </w:rPr>
+        <w:t xml:space="preserve">~€500–700m including a premium is fundable, but IPAR runs a conservative, licence-driven model in which balance-sheet strength is a commercial argument to licensors. Debt-funding changes that profile; equity-funding dilutes the founders' ~mid-40s% control of the parent — the one thing this structure exists to protect.</w:t>
       </w:r>
     </w:p>
     <w:p>
@@ -4233,10 +4277,360 @@
       </w:pPr>
       <w:r>
         <w:rPr>
-          <w:sz w:val="20"/>
-          <w:szCs w:val="20"/>
-        </w:rPr>
-        <w:t xml:space="preserve">Market data: Yahoo Finance, stockanalysis.com, Investing.com, CNBC, Boursorama, MarketScreener, ABC Bourse (prices, ranges, volumes, float 27.4%, index memberships), early August 2026.</w:t>
+          <w:b/>
+          <w:bCs/>
+          <w:sz w:val="20"/>
+          <w:szCs w:val="20"/>
+        </w:rPr>
+        <w:t xml:space="preserve">Creeping is legal but impractical. </w:t>
+      </w:r>
+      <w:r>
+        <w:rPr>
+          <w:sz w:val="20"/>
+          <w:szCs w:val="20"/>
+        </w:rPr>
+        <w:t xml:space="preserve">Above 50% of capital, French rules impose no mandatory-offer constraint on further market purchases, so IPAR could in principle creep upward. At €1.5–2m of daily liquidity, however, accumulating 8 points of capital (to reach the 80% treaty threshold, see below) or 18 points (to 90%) through the market would take years and move the price against the buyer.</w:t>
+      </w:r>
+    </w:p>
+    <w:p>
+      <w:pPr>
+        <w:pStyle w:val="Heading2"/>
+        <w:spacing w:after="80" w:before="200"/>
+      </w:pPr>
+      <w:r>
+        <w:rPr>
+          <w:b/>
+          <w:bCs/>
+          <w:color w:val="2E5597"/>
+          <w:sz w:val="22"/>
+          <w:szCs w:val="22"/>
+        </w:rPr>
+        <w:t xml:space="preserve">9.2 Tax: mostly an argument FOR buying in, not against</w:t>
+      </w:r>
+    </w:p>
+    <w:p>
+      <w:pPr>
+        <w:pStyle w:val="ListParagraph"/>
+        <w:numPr>
+          <w:ilvl w:val="0"/>
+          <w:numId w:val="2"/>
+        </w:numPr>
+        <w:spacing w:after="60" w:line="252"/>
+      </w:pPr>
+      <w:r>
+        <w:rPr>
+          <w:b/>
+          <w:bCs/>
+          <w:sz w:val="20"/>
+          <w:szCs w:val="20"/>
+        </w:rPr>
+        <w:t xml:space="preserve">Dividend withholding leakage today. </w:t>
+      </w:r>
+      <w:r>
+        <w:rPr>
+          <w:sz w:val="20"/>
+          <w:szCs w:val="20"/>
+        </w:rPr>
+        <w:t xml:space="preserve">Under the France–US treaty, dividends from ITP to IPAR bear 5% French withholding at ≥10% ownership; the 2009 protocol added a 0% rate at ≥80% ownership (subject to limitation-on-benefits tests that a Nasdaq-listed parent should satisfy via the publicly-traded test). At 72.3%, IPAR leaks ~5% of a ~€64m annual dividend stream (~€3m/yr). Reaching 80% would eliminate this — a modest but real incentive to go up, not stay put.</w:t>
+      </w:r>
+    </w:p>
+    <w:p>
+      <w:pPr>
+        <w:pStyle w:val="ListParagraph"/>
+        <w:numPr>
+          <w:ilvl w:val="0"/>
+          <w:numId w:val="2"/>
+        </w:numPr>
+        <w:spacing w:after="60" w:line="252"/>
+      </w:pPr>
+      <w:r>
+        <w:rPr>
+          <w:b/>
+          <w:bCs/>
+          <w:sz w:val="20"/>
+          <w:szCs w:val="20"/>
+        </w:rPr>
+        <w:t xml:space="preserve">No consolidation prize. </w:t>
+      </w:r>
+      <w:r>
+        <w:rPr>
+          <w:sz w:val="20"/>
+          <w:szCs w:val="20"/>
+        </w:rPr>
+        <w:t xml:space="preserve">French tax integration (intégration fiscale) requires 95% ownership and US consolidated-return treatment is unavailable for a foreign subsidiary regardless, so a buy-in unlocks no group-relief benefit. ITP is already a CFC for US purposes (GILTI applies at any level above 50%), and the ~25.8% French corporate rate broadly covers the US minimum-tax exposure — so the US tax position barely changes with ownership percentage.</w:t>
+      </w:r>
+    </w:p>
+    <w:p>
+      <w:pPr>
+        <w:pStyle w:val="ListParagraph"/>
+        <w:numPr>
+          <w:ilvl w:val="0"/>
+          <w:numId w:val="2"/>
+        </w:numPr>
+        <w:spacing w:after="60" w:line="252"/>
+      </w:pPr>
+      <w:r>
+        <w:rPr>
+          <w:b/>
+          <w:bCs/>
+          <w:sz w:val="20"/>
+          <w:szCs w:val="20"/>
+        </w:rPr>
+        <w:t xml:space="preserve">What they would avoid doing: </w:t>
+      </w:r>
+      <w:r>
+        <w:rPr>
+          <w:sz w:val="20"/>
+          <w:szCs w:val="20"/>
+        </w:rPr>
+        <w:t xml:space="preserve">a cross-border merger of ITP into IPAR (as opposed to a cash tender + squeeze-out of a still-French SA) would risk French exit taxation on migrating IP and tax residence and is the one genuinely tax-hostile route. Any buy-in would keep the SA French and simply delist it.</w:t>
+      </w:r>
+    </w:p>
+    <w:p>
+      <w:pPr>
+        <w:pStyle w:val="Heading2"/>
+        <w:spacing w:after="80" w:before="200"/>
+      </w:pPr>
+      <w:r>
+        <w:rPr>
+          <w:b/>
+          <w:bCs/>
+          <w:color w:val="2E5597"/>
+          <w:sz w:val="22"/>
+          <w:szCs w:val="22"/>
+        </w:rPr>
+        <w:t xml:space="preserve">9.3 The revealed preference: December 2025</w:t>
+      </w:r>
+    </w:p>
+    <w:p>
+      <w:pPr>
+        <w:spacing w:after="100" w:line="264"/>
+      </w:pPr>
+      <w:r>
+        <w:rPr>
+          <w:sz w:val="20"/>
+          <w:szCs w:val="20"/>
+        </w:rPr>
+        <w:t xml:space="preserve">The clearest evidence that no buy-in is intended is that management just had the perfect window and used it for something else. In November–December 2025 the group merged Interparfums Holding SAS (the non-operating intermediate holdco) into Interparfums SA, making IPAR the direct 72.3% shareholder; the AMF reviewed the operation and confirmed no withdrawal offer to minorities was required. They simplified the chain </w:t>
+      </w:r>
+      <w:r>
+        <w:rPr>
+          <w:b/>
+          <w:bCs/>
+          <w:sz w:val="20"/>
+          <w:szCs w:val="20"/>
+        </w:rPr>
+        <w:t xml:space="preserve">around</w:t>
+      </w:r>
+      <w:r>
+        <w:rPr>
+          <w:sz w:val="20"/>
+          <w:szCs w:val="20"/>
+        </w:rPr>
+        <w:t xml:space="preserve"> the minority listing rather than eliminating it. The Paris listing appears to be valued for its own sake: it preserves the group's French identity and credibility with predominantly French/European luxury licensors (Montblanc, Van Cleef &amp; Arpels, Lacoste, Longchamp), underpins Philippe Benacin's autonomous French executive platform, provides a local acquisition and incentive currency (free shares, SA-level plans), and costs almost nothing to maintain. Meanwhile IPAR's 83.2% voting control means a buy-in would purchase no additional control — only earnings it already consolidates — at a contested premium. </w:t>
+      </w:r>
+      <w:r>
+        <w:rPr>
+          <w:b/>
+          <w:bCs/>
+          <w:sz w:val="20"/>
+          <w:szCs w:val="20"/>
+        </w:rPr>
+        <w:t xml:space="preserve">Conclusion: the discount persists not because IPAR cannot buy in the minorities, but because it has never needed to — and the structure is working as designed for the people who control it.</w:t>
+      </w:r>
+    </w:p>
+    <w:p>
+      <w:pPr>
+        <w:pStyle w:val="Heading1"/>
+        <w:spacing w:after="120" w:before="280"/>
+      </w:pPr>
+      <w:r>
+        <w:rPr>
+          <w:b/>
+          <w:bCs/>
+          <w:color w:val="1F3864"/>
+          <w:sz w:val="26"/>
+          <w:szCs w:val="26"/>
+        </w:rPr>
+        <w:t xml:space="preserve">10. Conclusion</w:t>
+      </w:r>
+    </w:p>
+    <w:p>
+      <w:pPr>
+        <w:spacing w:after="100" w:line="264"/>
+      </w:pPr>
+      <w:r>
+        <w:rPr>
+          <w:sz w:val="20"/>
+          <w:szCs w:val="20"/>
+        </w:rPr>
+        <w:t xml:space="preserve">IPAR US's premium over ITP FP is the sum of three stacked effects: </w:t>
+      </w:r>
+      <w:r>
+        <w:rPr>
+          <w:b/>
+          <w:bCs/>
+          <w:sz w:val="20"/>
+          <w:szCs w:val="20"/>
+        </w:rPr>
+        <w:t xml:space="preserve">(i) a composition effect</w:t>
+      </w:r>
+      <w:r>
+        <w:rPr>
+          <w:sz w:val="20"/>
+          <w:szCs w:val="20"/>
+        </w:rPr>
+        <w:t xml:space="preserve"> — IPAR includes a wholly-owned US business currently growing 18% that ITP holders don't touch; </w:t>
+      </w:r>
+      <w:r>
+        <w:rPr>
+          <w:b/>
+          <w:bCs/>
+          <w:sz w:val="20"/>
+          <w:szCs w:val="20"/>
+        </w:rPr>
+        <w:t xml:space="preserve">(ii) a structural market-access effect</w:t>
+      </w:r>
+      <w:r>
+        <w:rPr>
+          <w:sz w:val="20"/>
+          <w:szCs w:val="20"/>
+        </w:rPr>
+        <w:t xml:space="preserve"> — liquidity, float, US indices, coverage and control all reside with the parent; and </w:t>
+      </w:r>
+      <w:r>
+        <w:rPr>
+          <w:b/>
+          <w:bCs/>
+          <w:sz w:val="20"/>
+          <w:szCs w:val="20"/>
+        </w:rPr>
+        <w:t xml:space="preserve">(iii) a 12-month news-flow effect</w:t>
+      </w:r>
+      <w:r>
+        <w:rPr>
+          <w:sz w:val="20"/>
+          <w:szCs w:val="20"/>
+        </w:rPr>
+        <w:t xml:space="preserve"> — FX translation and a run of SA-level disappointments (guidance fog, margin cut, Boucheron, Middle East, tariffs, Lacoste) de-rated the Paris line by ~25% while IPAR recovered fully from its own governance wobble. On look-through economics ITP is unambiguously the cheaper claim on the group's best assets and pays ~4%+ to wait; but with no buy-in catalyst, a 27% float and €1.5–2m daily liquidity, cheapness alone has never been sufficient here. For absolute-return investors the Paris line is a patient, income-carrying value position; for anyone benchmarked, liquidity-constrained or momentum-aware, the market's verdict — pay up for the parent — is likely to remain the path of least resistance into 2027.</w:t>
+      </w:r>
+    </w:p>
+    <w:p>
+      <w:pPr>
+        <w:pStyle w:val="Heading1"/>
+        <w:spacing w:after="120" w:before="280"/>
+      </w:pPr>
+      <w:r>
+        <w:rPr>
+          <w:b/>
+          <w:bCs/>
+          <w:color w:val="1F3864"/>
+          <w:sz w:val="26"/>
+          <w:szCs w:val="26"/>
+        </w:rPr>
+        <w:t xml:space="preserve">Appendix: Principal Sources</w:t>
+      </w:r>
+    </w:p>
+    <w:p>
+      <w:pPr>
+        <w:pStyle w:val="ListParagraph"/>
+        <w:numPr>
+          <w:ilvl w:val="0"/>
+          <w:numId w:val="2"/>
+        </w:numPr>
+        <w:spacing w:after="60" w:line="252"/>
+      </w:pPr>
+      <w:r>
+        <w:rPr>
+          <w:sz w:val="20"/>
+          <w:szCs w:val="20"/>
+        </w:rPr>
+        <w:t xml:space="preserve">Interparfums Inc press releases: record FY2025 results (24 Feb 2026); Q1 2026 results (5 May 2026); Q2 2026 net sales (22 Jul 2026); Q2/H1 2026 results and reaffirmed guidance (4 Aug 2026) — GlobeNewswire/SEC filings.</w:t>
+      </w:r>
+    </w:p>
+    <w:p>
+      <w:pPr>
+        <w:pStyle w:val="ListParagraph"/>
+        <w:numPr>
+          <w:ilvl w:val="0"/>
+          <w:numId w:val="2"/>
+        </w:numPr>
+        <w:spacing w:after="60" w:line="252"/>
+      </w:pPr>
+      <w:r>
+        <w:rPr>
+          <w:sz w:val="20"/>
+          <w:szCs w:val="20"/>
+        </w:rPr>
+        <w:t xml:space="preserve">Interparfums SA (interparfums-finance.fr): H1 2026 sales release (€414.3m, −3.7% cc / −7.3% reported; FY26 guide €850–870m); FY2025 results (operating margin 19.5%, net margin 14.1%, dividend €1.05).</w:t>
+      </w:r>
+    </w:p>
+    <w:p>
+      <w:pPr>
+        <w:pStyle w:val="ListParagraph"/>
+        <w:numPr>
+          <w:ilvl w:val="0"/>
+          <w:numId w:val="2"/>
+        </w:numPr>
+        <w:spacing w:after="60" w:line="252"/>
+      </w:pPr>
+      <w:r>
+        <w:rPr>
+          <w:sz w:val="20"/>
+          <w:szCs w:val="20"/>
+        </w:rPr>
+        <w:t xml:space="preserve">SEC filings: NT 10-K (Mar 2026); 8-K auditor change Forvis Mazars → Grant Thornton (May 2026) via StockTitan/Investing.com summaries.</w:t>
+      </w:r>
+    </w:p>
+    <w:p>
+      <w:pPr>
+        <w:pStyle w:val="ListParagraph"/>
+        <w:numPr>
+          <w:ilvl w:val="0"/>
+          <w:numId w:val="2"/>
+        </w:numPr>
+        <w:spacing w:after="60" w:line="252"/>
+      </w:pPr>
+      <w:r>
+        <w:rPr>
+          <w:sz w:val="20"/>
+          <w:szCs w:val="20"/>
+        </w:rPr>
+        <w:t xml:space="preserve">Market data: Yahoo Finance, stockanalysis.com, Investing.com, CNBC, Boursorama, MarketScreener, ABC Bourse (prices, ranges, volumes, float 27.4%, index memberships), early August 2026; Interparfums SA monthly voting-rights declarations (83.8m shares / ~144.8m net voting rights, mid-2026).</w:t>
+      </w:r>
+    </w:p>
+    <w:p>
+      <w:pPr>
+        <w:pStyle w:val="ListParagraph"/>
+        <w:numPr>
+          <w:ilvl w:val="0"/>
+          <w:numId w:val="2"/>
+        </w:numPr>
+        <w:spacing w:after="60" w:line="252"/>
+      </w:pPr>
+      <w:r>
+        <w:rPr>
+          <w:sz w:val="20"/>
+          <w:szCs w:val="20"/>
+        </w:rPr>
+        <w:t xml:space="preserve">Holdco merger: Interparfums SA / Euronext press releases on the absorption of Interparfums Holding SAS (Nov 2025; AMF Art. 236-6 review 6 Nov 2025; EGM 17 Dec 2025); AMF/DILA filing of the merger project (Jun 2025).</w:t>
+      </w:r>
+    </w:p>
+    <w:p>
+      <w:pPr>
+        <w:pStyle w:val="ListParagraph"/>
+        <w:numPr>
+          <w:ilvl w:val="0"/>
+          <w:numId w:val="2"/>
+        </w:numPr>
+        <w:spacing w:after="60" w:line="252"/>
+      </w:pPr>
+      <w:r>
+        <w:rPr>
+          <w:sz w:val="20"/>
+          <w:szCs w:val="20"/>
+        </w:rPr>
+        <w:t xml:space="preserve">Legal/tax framework: PACTE law 2019 squeeze-out threshold (90% of capital and voting rights) — Linklaters, Baker McKenzie, CMS takeover guides; France–US income tax treaty Art. 10 as amended by the 2009 Protocol (5% withholding at ≥10% ownership; 0% at ≥80% subject to LOB) — JCT explanation, KPMG.</w:t>
       </w:r>
     </w:p>
     <w:p>

</xml_diff>